<commit_message>
mise à jour kubernetes
</commit_message>
<xml_diff>
--- a/DOCKERS/Dockers.docx
+++ b/DOCKERS/Dockers.docx
@@ -1,6 +1,6 @@
 
 <file path=word/document.xml><?xml version="1.0" encoding="utf-8"?>
-<w:document xmlns:wpc="http://schemas.microsoft.com/office/word/2010/wordprocessingCanvas" xmlns:cx="http://schemas.microsoft.com/office/drawing/2014/chartex" xmlns:cx1="http://schemas.microsoft.com/office/drawing/2015/9/8/chartex" xmlns:cx2="http://schemas.microsoft.com/office/drawing/2015/10/21/chartex" xmlns:cx3="http://schemas.microsoft.com/office/drawing/2016/5/9/chartex" xmlns:cx4="http://schemas.microsoft.com/office/drawing/2016/5/10/chartex" xmlns:cx5="http://schemas.microsoft.com/office/drawing/2016/5/11/chartex" xmlns:cx6="http://schemas.microsoft.com/office/drawing/2016/5/12/chartex" xmlns:cx7="http://schemas.microsoft.com/office/drawing/2016/5/13/chartex" xmlns:cx8="http://schemas.microsoft.com/office/drawing/2016/5/14/chartex" xmlns:mc="http://schemas.openxmlformats.org/markup-compatibility/2006" xmlns:aink="http://schemas.microsoft.com/office/drawing/2016/ink" xmlns:am3d="http://schemas.microsoft.com/office/drawing/2017/model3d" xmlns:o="urn:schemas-microsoft-com:office:office" xmlns:oel="http://schemas.microsoft.com/office/2019/extlst" xmlns:r="http://schemas.openxmlformats.org/officeDocument/2006/relationships" xmlns:m="http://schemas.openxmlformats.org/officeDocument/2006/math" xmlns:v="urn:schemas-microsoft-com:vml" xmlns:wp14="http://schemas.microsoft.com/office/word/2010/wordprocessingDrawing" xmlns:wp="http://schemas.openxmlformats.org/drawingml/2006/wordprocessingDrawing" xmlns:w10="urn:schemas-microsoft-com:office:word" xmlns:w="http://schemas.openxmlformats.org/wordprocessingml/2006/main" xmlns:w14="http://schemas.microsoft.com/office/word/2010/wordml" xmlns:w15="http://schemas.microsoft.com/office/word/2012/wordml" xmlns:w16cei="http://schemas.microsoft.com/office/word/2026/wordml/cei" xmlns:w16cex="http://schemas.microsoft.com/office/word/2018/wordml/cex" xmlns:w16cid="http://schemas.microsoft.com/office/word/2016/wordml/cid" xmlns:w16="http://schemas.microsoft.com/office/word/2018/wordml" xmlns:w16du="http://schemas.microsoft.com/office/word/2023/wordml/word16du" xmlns:w16sdtdh="http://schemas.microsoft.com/office/word/2020/wordml/sdtdatahash" xmlns:w16sdtfl="http://schemas.microsoft.com/office/word/2024/wordml/sdtformatlock" xmlns:w16se="http://schemas.microsoft.com/office/word/2015/wordml/symex" xmlns:wpg="http://schemas.microsoft.com/office/word/2010/wordprocessingGroup" xmlns:wpi="http://schemas.microsoft.com/office/word/2010/wordprocessingInk" xmlns:wne="http://schemas.microsoft.com/office/word/2006/wordml" xmlns:wps="http://schemas.microsoft.com/office/word/2010/wordprocessingShape" mc:Ignorable="w14 w15 w16se w16cid w16 w16cex w16sdtdh w16sdtfl w16du wp14">
+<w:document xmlns:wpc="http://schemas.microsoft.com/office/word/2010/wordprocessingCanvas" xmlns:cx="http://schemas.microsoft.com/office/drawing/2014/chartex" xmlns:cx1="http://schemas.microsoft.com/office/drawing/2015/9/8/chartex" xmlns:cx2="http://schemas.microsoft.com/office/drawing/2015/10/21/chartex" xmlns:cx3="http://schemas.microsoft.com/office/drawing/2016/5/9/chartex" xmlns:cx4="http://schemas.microsoft.com/office/drawing/2016/5/10/chartex" xmlns:cx5="http://schemas.microsoft.com/office/drawing/2016/5/11/chartex" xmlns:cx6="http://schemas.microsoft.com/office/drawing/2016/5/12/chartex" xmlns:cx7="http://schemas.microsoft.com/office/drawing/2016/5/13/chartex" xmlns:cx8="http://schemas.microsoft.com/office/drawing/2016/5/14/chartex" xmlns:mc="http://schemas.openxmlformats.org/markup-compatibility/2006" xmlns:aink="http://schemas.microsoft.com/office/drawing/2016/ink" xmlns:am3d="http://schemas.microsoft.com/office/drawing/2017/model3d" xmlns:o="urn:schemas-microsoft-com:office:office" xmlns:oel="http://schemas.microsoft.com/office/2019/extlst" xmlns:r="http://schemas.openxmlformats.org/officeDocument/2006/relationships" xmlns:m="http://schemas.openxmlformats.org/officeDocument/2006/math" xmlns:v="urn:schemas-microsoft-com:vml" xmlns:wp14="http://schemas.microsoft.com/office/word/2010/wordprocessingDrawing" xmlns:wp="http://schemas.openxmlformats.org/drawingml/2006/wordprocessingDrawing" xmlns:w10="urn:schemas-microsoft-com:office:word" xmlns:w="http://schemas.openxmlformats.org/wordprocessingml/2006/main" xmlns:w14="http://schemas.microsoft.com/office/word/2010/wordml" xmlns:w15="http://schemas.microsoft.com/office/word/2012/wordml" xmlns:w16cex="http://schemas.microsoft.com/office/word/2018/wordml/cex" xmlns:w16cid="http://schemas.microsoft.com/office/word/2016/wordml/cid" xmlns:w16="http://schemas.microsoft.com/office/word/2018/wordml" xmlns:w16du="http://schemas.microsoft.com/office/word/2023/wordml/word16du" xmlns:w16sdtdh="http://schemas.microsoft.com/office/word/2020/wordml/sdtdatahash" xmlns:w16sdtfl="http://schemas.microsoft.com/office/word/2024/wordml/sdtformatlock" xmlns:w16se="http://schemas.microsoft.com/office/word/2015/wordml/symex" xmlns:wpg="http://schemas.microsoft.com/office/word/2010/wordprocessingGroup" xmlns:wpi="http://schemas.microsoft.com/office/word/2010/wordprocessingInk" xmlns:wne="http://schemas.microsoft.com/office/word/2006/wordml" xmlns:wps="http://schemas.microsoft.com/office/word/2010/wordprocessingShape" mc:Ignorable="w14 w15 w16se w16cid w16 w16cex w16sdtdh w16sdtfl w16du wp14">
   <w:body>
     <w:p>
       <w:pPr>
@@ -95,6 +95,20 @@
           <w:szCs w:val="20"/>
         </w:rPr>
         <w:t>En informatique, un conteneur est une boîte virtuelle légère qui enferme une application et tout ce dont elle a besoin pour fonctionner (code, fichiers, outils et réglages).</w:t>
+      </w:r>
+      <w:r>
+        <w:rPr>
+          <w:sz w:val="20"/>
+          <w:szCs w:val="20"/>
+        </w:rPr>
+        <w:t xml:space="preserve"> C’est une unité de déploiement légère qui encapsule une </w:t>
+      </w:r>
+      <w:r>
+        <w:rPr>
+          <w:sz w:val="20"/>
+          <w:szCs w:val="20"/>
+        </w:rPr>
+        <w:t>application et toutes ses dépendances</w:t>
       </w:r>
     </w:p>
     <w:p>
@@ -1187,7 +1201,6 @@
           <w:sz w:val="20"/>
           <w:szCs w:val="20"/>
         </w:rPr>
-        <w:lastRenderedPageBreak/>
         <w:t>Comparaison</w:t>
       </w:r>
       <w:r>
@@ -1983,7 +1996,6 @@
           <w:sz w:val="20"/>
           <w:szCs w:val="20"/>
         </w:rPr>
-        <w:lastRenderedPageBreak/>
         <w:t>Comment exécuter une image : d</w:t>
       </w:r>
       <w:r>
@@ -3726,7 +3738,6 @@
           <w:bCs/>
           <w:color w:val="A02B93" w:themeColor="accent5"/>
         </w:rPr>
-        <w:lastRenderedPageBreak/>
         <w:t xml:space="preserve">DOCKER – </w:t>
       </w:r>
       <w:r>
@@ -4148,7 +4159,6 @@
           <w:sz w:val="20"/>
           <w:szCs w:val="20"/>
         </w:rPr>
-        <w:lastRenderedPageBreak/>
         <w:t>Docker – Gestion de Réseau :</w:t>
       </w:r>
     </w:p>
@@ -4867,7 +4877,6 @@
           <w:sz w:val="20"/>
           <w:szCs w:val="20"/>
         </w:rPr>
-        <w:lastRenderedPageBreak/>
         <w:t>Drivers :</w:t>
       </w:r>
     </w:p>
@@ -5055,7 +5064,7 @@
 </file>
 
 <file path=word/endnotes.xml><?xml version="1.0" encoding="utf-8"?>
-<w:endnotes xmlns:wpc="http://schemas.microsoft.com/office/word/2010/wordprocessingCanvas" xmlns:cx="http://schemas.microsoft.com/office/drawing/2014/chartex" xmlns:cx1="http://schemas.microsoft.com/office/drawing/2015/9/8/chartex" xmlns:cx2="http://schemas.microsoft.com/office/drawing/2015/10/21/chartex" xmlns:cx3="http://schemas.microsoft.com/office/drawing/2016/5/9/chartex" xmlns:cx4="http://schemas.microsoft.com/office/drawing/2016/5/10/chartex" xmlns:cx5="http://schemas.microsoft.com/office/drawing/2016/5/11/chartex" xmlns:cx6="http://schemas.microsoft.com/office/drawing/2016/5/12/chartex" xmlns:cx7="http://schemas.microsoft.com/office/drawing/2016/5/13/chartex" xmlns:cx8="http://schemas.microsoft.com/office/drawing/2016/5/14/chartex" xmlns:mc="http://schemas.openxmlformats.org/markup-compatibility/2006" xmlns:aink="http://schemas.microsoft.com/office/drawing/2016/ink" xmlns:am3d="http://schemas.microsoft.com/office/drawing/2017/model3d" xmlns:o="urn:schemas-microsoft-com:office:office" xmlns:oel="http://schemas.microsoft.com/office/2019/extlst" xmlns:r="http://schemas.openxmlformats.org/officeDocument/2006/relationships" xmlns:m="http://schemas.openxmlformats.org/officeDocument/2006/math" xmlns:v="urn:schemas-microsoft-com:vml" xmlns:wp14="http://schemas.microsoft.com/office/word/2010/wordprocessingDrawing" xmlns:wp="http://schemas.openxmlformats.org/drawingml/2006/wordprocessingDrawing" xmlns:w10="urn:schemas-microsoft-com:office:word" xmlns:w="http://schemas.openxmlformats.org/wordprocessingml/2006/main" xmlns:w14="http://schemas.microsoft.com/office/word/2010/wordml" xmlns:w15="http://schemas.microsoft.com/office/word/2012/wordml" xmlns:w16cei="http://schemas.microsoft.com/office/word/2026/wordml/cei" xmlns:w16cex="http://schemas.microsoft.com/office/word/2018/wordml/cex" xmlns:w16cid="http://schemas.microsoft.com/office/word/2016/wordml/cid" xmlns:w16="http://schemas.microsoft.com/office/word/2018/wordml" xmlns:w16du="http://schemas.microsoft.com/office/word/2023/wordml/word16du" xmlns:w16sdtdh="http://schemas.microsoft.com/office/word/2020/wordml/sdtdatahash" xmlns:w16sdtfl="http://schemas.microsoft.com/office/word/2024/wordml/sdtformatlock" xmlns:w16se="http://schemas.microsoft.com/office/word/2015/wordml/symex" xmlns:wpg="http://schemas.microsoft.com/office/word/2010/wordprocessingGroup" xmlns:wpi="http://schemas.microsoft.com/office/word/2010/wordprocessingInk" xmlns:wne="http://schemas.microsoft.com/office/word/2006/wordml" xmlns:wps="http://schemas.microsoft.com/office/word/2010/wordprocessingShape" mc:Ignorable="w14 w15 w16se w16cid w16 w16cex w16sdtdh w16sdtfl w16du wp14">
+<w:endnotes xmlns:wpc="http://schemas.microsoft.com/office/word/2010/wordprocessingCanvas" xmlns:cx="http://schemas.microsoft.com/office/drawing/2014/chartex" xmlns:cx1="http://schemas.microsoft.com/office/drawing/2015/9/8/chartex" xmlns:cx2="http://schemas.microsoft.com/office/drawing/2015/10/21/chartex" xmlns:cx3="http://schemas.microsoft.com/office/drawing/2016/5/9/chartex" xmlns:cx4="http://schemas.microsoft.com/office/drawing/2016/5/10/chartex" xmlns:cx5="http://schemas.microsoft.com/office/drawing/2016/5/11/chartex" xmlns:cx6="http://schemas.microsoft.com/office/drawing/2016/5/12/chartex" xmlns:cx7="http://schemas.microsoft.com/office/drawing/2016/5/13/chartex" xmlns:cx8="http://schemas.microsoft.com/office/drawing/2016/5/14/chartex" xmlns:mc="http://schemas.openxmlformats.org/markup-compatibility/2006" xmlns:aink="http://schemas.microsoft.com/office/drawing/2016/ink" xmlns:am3d="http://schemas.microsoft.com/office/drawing/2017/model3d" xmlns:o="urn:schemas-microsoft-com:office:office" xmlns:oel="http://schemas.microsoft.com/office/2019/extlst" xmlns:r="http://schemas.openxmlformats.org/officeDocument/2006/relationships" xmlns:m="http://schemas.openxmlformats.org/officeDocument/2006/math" xmlns:v="urn:schemas-microsoft-com:vml" xmlns:wp14="http://schemas.microsoft.com/office/word/2010/wordprocessingDrawing" xmlns:wp="http://schemas.openxmlformats.org/drawingml/2006/wordprocessingDrawing" xmlns:w10="urn:schemas-microsoft-com:office:word" xmlns:w="http://schemas.openxmlformats.org/wordprocessingml/2006/main" xmlns:w14="http://schemas.microsoft.com/office/word/2010/wordml" xmlns:w15="http://schemas.microsoft.com/office/word/2012/wordml" xmlns:w16cex="http://schemas.microsoft.com/office/word/2018/wordml/cex" xmlns:w16cid="http://schemas.microsoft.com/office/word/2016/wordml/cid" xmlns:w16="http://schemas.microsoft.com/office/word/2018/wordml" xmlns:w16du="http://schemas.microsoft.com/office/word/2023/wordml/word16du" xmlns:w16sdtdh="http://schemas.microsoft.com/office/word/2020/wordml/sdtdatahash" xmlns:w16sdtfl="http://schemas.microsoft.com/office/word/2024/wordml/sdtformatlock" xmlns:w16se="http://schemas.microsoft.com/office/word/2015/wordml/symex" xmlns:wpg="http://schemas.microsoft.com/office/word/2010/wordprocessingGroup" xmlns:wpi="http://schemas.microsoft.com/office/word/2010/wordprocessingInk" xmlns:wne="http://schemas.microsoft.com/office/word/2006/wordml" xmlns:wps="http://schemas.microsoft.com/office/word/2010/wordprocessingShape" mc:Ignorable="w14 w15 w16se w16cid w16 w16cex w16sdtdh w16sdtfl w16du wp14">
   <w:endnote w:type="separator" w:id="-1">
     <w:p>
       <w:pPr>
@@ -5080,7 +5089,7 @@
 </file>
 
 <file path=word/footnotes.xml><?xml version="1.0" encoding="utf-8"?>
-<w:footnotes xmlns:wpc="http://schemas.microsoft.com/office/word/2010/wordprocessingCanvas" xmlns:cx="http://schemas.microsoft.com/office/drawing/2014/chartex" xmlns:cx1="http://schemas.microsoft.com/office/drawing/2015/9/8/chartex" xmlns:cx2="http://schemas.microsoft.com/office/drawing/2015/10/21/chartex" xmlns:cx3="http://schemas.microsoft.com/office/drawing/2016/5/9/chartex" xmlns:cx4="http://schemas.microsoft.com/office/drawing/2016/5/10/chartex" xmlns:cx5="http://schemas.microsoft.com/office/drawing/2016/5/11/chartex" xmlns:cx6="http://schemas.microsoft.com/office/drawing/2016/5/12/chartex" xmlns:cx7="http://schemas.microsoft.com/office/drawing/2016/5/13/chartex" xmlns:cx8="http://schemas.microsoft.com/office/drawing/2016/5/14/chartex" xmlns:mc="http://schemas.openxmlformats.org/markup-compatibility/2006" xmlns:aink="http://schemas.microsoft.com/office/drawing/2016/ink" xmlns:am3d="http://schemas.microsoft.com/office/drawing/2017/model3d" xmlns:o="urn:schemas-microsoft-com:office:office" xmlns:oel="http://schemas.microsoft.com/office/2019/extlst" xmlns:r="http://schemas.openxmlformats.org/officeDocument/2006/relationships" xmlns:m="http://schemas.openxmlformats.org/officeDocument/2006/math" xmlns:v="urn:schemas-microsoft-com:vml" xmlns:wp14="http://schemas.microsoft.com/office/word/2010/wordprocessingDrawing" xmlns:wp="http://schemas.openxmlformats.org/drawingml/2006/wordprocessingDrawing" xmlns:w10="urn:schemas-microsoft-com:office:word" xmlns:w="http://schemas.openxmlformats.org/wordprocessingml/2006/main" xmlns:w14="http://schemas.microsoft.com/office/word/2010/wordml" xmlns:w15="http://schemas.microsoft.com/office/word/2012/wordml" xmlns:w16cei="http://schemas.microsoft.com/office/word/2026/wordml/cei" xmlns:w16cex="http://schemas.microsoft.com/office/word/2018/wordml/cex" xmlns:w16cid="http://schemas.microsoft.com/office/word/2016/wordml/cid" xmlns:w16="http://schemas.microsoft.com/office/word/2018/wordml" xmlns:w16du="http://schemas.microsoft.com/office/word/2023/wordml/word16du" xmlns:w16sdtdh="http://schemas.microsoft.com/office/word/2020/wordml/sdtdatahash" xmlns:w16sdtfl="http://schemas.microsoft.com/office/word/2024/wordml/sdtformatlock" xmlns:w16se="http://schemas.microsoft.com/office/word/2015/wordml/symex" xmlns:wpg="http://schemas.microsoft.com/office/word/2010/wordprocessingGroup" xmlns:wpi="http://schemas.microsoft.com/office/word/2010/wordprocessingInk" xmlns:wne="http://schemas.microsoft.com/office/word/2006/wordml" xmlns:wps="http://schemas.microsoft.com/office/word/2010/wordprocessingShape" mc:Ignorable="w14 w15 w16se w16cid w16 w16cex w16sdtdh w16sdtfl w16du wp14">
+<w:footnotes xmlns:wpc="http://schemas.microsoft.com/office/word/2010/wordprocessingCanvas" xmlns:cx="http://schemas.microsoft.com/office/drawing/2014/chartex" xmlns:cx1="http://schemas.microsoft.com/office/drawing/2015/9/8/chartex" xmlns:cx2="http://schemas.microsoft.com/office/drawing/2015/10/21/chartex" xmlns:cx3="http://schemas.microsoft.com/office/drawing/2016/5/9/chartex" xmlns:cx4="http://schemas.microsoft.com/office/drawing/2016/5/10/chartex" xmlns:cx5="http://schemas.microsoft.com/office/drawing/2016/5/11/chartex" xmlns:cx6="http://schemas.microsoft.com/office/drawing/2016/5/12/chartex" xmlns:cx7="http://schemas.microsoft.com/office/drawing/2016/5/13/chartex" xmlns:cx8="http://schemas.microsoft.com/office/drawing/2016/5/14/chartex" xmlns:mc="http://schemas.openxmlformats.org/markup-compatibility/2006" xmlns:aink="http://schemas.microsoft.com/office/drawing/2016/ink" xmlns:am3d="http://schemas.microsoft.com/office/drawing/2017/model3d" xmlns:o="urn:schemas-microsoft-com:office:office" xmlns:oel="http://schemas.microsoft.com/office/2019/extlst" xmlns:r="http://schemas.openxmlformats.org/officeDocument/2006/relationships" xmlns:m="http://schemas.openxmlformats.org/officeDocument/2006/math" xmlns:v="urn:schemas-microsoft-com:vml" xmlns:wp14="http://schemas.microsoft.com/office/word/2010/wordprocessingDrawing" xmlns:wp="http://schemas.openxmlformats.org/drawingml/2006/wordprocessingDrawing" xmlns:w10="urn:schemas-microsoft-com:office:word" xmlns:w="http://schemas.openxmlformats.org/wordprocessingml/2006/main" xmlns:w14="http://schemas.microsoft.com/office/word/2010/wordml" xmlns:w15="http://schemas.microsoft.com/office/word/2012/wordml" xmlns:w16cex="http://schemas.microsoft.com/office/word/2018/wordml/cex" xmlns:w16cid="http://schemas.microsoft.com/office/word/2016/wordml/cid" xmlns:w16="http://schemas.microsoft.com/office/word/2018/wordml" xmlns:w16du="http://schemas.microsoft.com/office/word/2023/wordml/word16du" xmlns:w16sdtdh="http://schemas.microsoft.com/office/word/2020/wordml/sdtdatahash" xmlns:w16sdtfl="http://schemas.microsoft.com/office/word/2024/wordml/sdtformatlock" xmlns:w16se="http://schemas.microsoft.com/office/word/2015/wordml/symex" xmlns:wpg="http://schemas.microsoft.com/office/word/2010/wordprocessingGroup" xmlns:wpi="http://schemas.microsoft.com/office/word/2010/wordprocessingInk" xmlns:wne="http://schemas.microsoft.com/office/word/2006/wordml" xmlns:wps="http://schemas.microsoft.com/office/word/2010/wordprocessingShape" mc:Ignorable="w14 w15 w16se w16cid w16 w16cex w16sdtdh w16sdtfl w16du wp14">
   <w:footnote w:type="separator" w:id="-1">
     <w:p>
       <w:pPr>
@@ -5105,7 +5114,7 @@
 </file>
 
 <file path=word/header1.xml><?xml version="1.0" encoding="utf-8"?>
-<w:hdr xmlns:wpc="http://schemas.microsoft.com/office/word/2010/wordprocessingCanvas" xmlns:cx="http://schemas.microsoft.com/office/drawing/2014/chartex" xmlns:cx1="http://schemas.microsoft.com/office/drawing/2015/9/8/chartex" xmlns:cx2="http://schemas.microsoft.com/office/drawing/2015/10/21/chartex" xmlns:cx3="http://schemas.microsoft.com/office/drawing/2016/5/9/chartex" xmlns:cx4="http://schemas.microsoft.com/office/drawing/2016/5/10/chartex" xmlns:cx5="http://schemas.microsoft.com/office/drawing/2016/5/11/chartex" xmlns:cx6="http://schemas.microsoft.com/office/drawing/2016/5/12/chartex" xmlns:cx7="http://schemas.microsoft.com/office/drawing/2016/5/13/chartex" xmlns:cx8="http://schemas.microsoft.com/office/drawing/2016/5/14/chartex" xmlns:mc="http://schemas.openxmlformats.org/markup-compatibility/2006" xmlns:aink="http://schemas.microsoft.com/office/drawing/2016/ink" xmlns:am3d="http://schemas.microsoft.com/office/drawing/2017/model3d" xmlns:o="urn:schemas-microsoft-com:office:office" xmlns:oel="http://schemas.microsoft.com/office/2019/extlst" xmlns:r="http://schemas.openxmlformats.org/officeDocument/2006/relationships" xmlns:m="http://schemas.openxmlformats.org/officeDocument/2006/math" xmlns:v="urn:schemas-microsoft-com:vml" xmlns:wp14="http://schemas.microsoft.com/office/word/2010/wordprocessingDrawing" xmlns:wp="http://schemas.openxmlformats.org/drawingml/2006/wordprocessingDrawing" xmlns:w10="urn:schemas-microsoft-com:office:word" xmlns:w="http://schemas.openxmlformats.org/wordprocessingml/2006/main" xmlns:w14="http://schemas.microsoft.com/office/word/2010/wordml" xmlns:w15="http://schemas.microsoft.com/office/word/2012/wordml" xmlns:w16cei="http://schemas.microsoft.com/office/word/2026/wordml/cei" xmlns:w16cex="http://schemas.microsoft.com/office/word/2018/wordml/cex" xmlns:w16cid="http://schemas.microsoft.com/office/word/2016/wordml/cid" xmlns:w16="http://schemas.microsoft.com/office/word/2018/wordml" xmlns:w16du="http://schemas.microsoft.com/office/word/2023/wordml/word16du" xmlns:w16sdtdh="http://schemas.microsoft.com/office/word/2020/wordml/sdtdatahash" xmlns:w16sdtfl="http://schemas.microsoft.com/office/word/2024/wordml/sdtformatlock" xmlns:w16se="http://schemas.microsoft.com/office/word/2015/wordml/symex" xmlns:wpg="http://schemas.microsoft.com/office/word/2010/wordprocessingGroup" xmlns:wpi="http://schemas.microsoft.com/office/word/2010/wordprocessingInk" xmlns:wne="http://schemas.microsoft.com/office/word/2006/wordml" xmlns:wps="http://schemas.microsoft.com/office/word/2010/wordprocessingShape" mc:Ignorable="w14 w15 w16se w16cid w16 w16cex w16sdtdh w16sdtfl w16du wp14">
+<w:hdr xmlns:wpc="http://schemas.microsoft.com/office/word/2010/wordprocessingCanvas" xmlns:cx="http://schemas.microsoft.com/office/drawing/2014/chartex" xmlns:cx1="http://schemas.microsoft.com/office/drawing/2015/9/8/chartex" xmlns:cx2="http://schemas.microsoft.com/office/drawing/2015/10/21/chartex" xmlns:cx3="http://schemas.microsoft.com/office/drawing/2016/5/9/chartex" xmlns:cx4="http://schemas.microsoft.com/office/drawing/2016/5/10/chartex" xmlns:cx5="http://schemas.microsoft.com/office/drawing/2016/5/11/chartex" xmlns:cx6="http://schemas.microsoft.com/office/drawing/2016/5/12/chartex" xmlns:cx7="http://schemas.microsoft.com/office/drawing/2016/5/13/chartex" xmlns:cx8="http://schemas.microsoft.com/office/drawing/2016/5/14/chartex" xmlns:mc="http://schemas.openxmlformats.org/markup-compatibility/2006" xmlns:aink="http://schemas.microsoft.com/office/drawing/2016/ink" xmlns:am3d="http://schemas.microsoft.com/office/drawing/2017/model3d" xmlns:o="urn:schemas-microsoft-com:office:office" xmlns:oel="http://schemas.microsoft.com/office/2019/extlst" xmlns:r="http://schemas.openxmlformats.org/officeDocument/2006/relationships" xmlns:m="http://schemas.openxmlformats.org/officeDocument/2006/math" xmlns:v="urn:schemas-microsoft-com:vml" xmlns:wp14="http://schemas.microsoft.com/office/word/2010/wordprocessingDrawing" xmlns:wp="http://schemas.openxmlformats.org/drawingml/2006/wordprocessingDrawing" xmlns:w10="urn:schemas-microsoft-com:office:word" xmlns:w="http://schemas.openxmlformats.org/wordprocessingml/2006/main" xmlns:w14="http://schemas.microsoft.com/office/word/2010/wordml" xmlns:w15="http://schemas.microsoft.com/office/word/2012/wordml" xmlns:w16cex="http://schemas.microsoft.com/office/word/2018/wordml/cex" xmlns:w16cid="http://schemas.microsoft.com/office/word/2016/wordml/cid" xmlns:w16="http://schemas.microsoft.com/office/word/2018/wordml" xmlns:w16du="http://schemas.microsoft.com/office/word/2023/wordml/word16du" xmlns:w16sdtdh="http://schemas.microsoft.com/office/word/2020/wordml/sdtdatahash" xmlns:w16sdtfl="http://schemas.microsoft.com/office/word/2024/wordml/sdtformatlock" xmlns:w16se="http://schemas.microsoft.com/office/word/2015/wordml/symex" xmlns:wpg="http://schemas.microsoft.com/office/word/2010/wordprocessingGroup" xmlns:wpi="http://schemas.microsoft.com/office/word/2010/wordprocessingInk" xmlns:wne="http://schemas.microsoft.com/office/word/2006/wordml" xmlns:wps="http://schemas.microsoft.com/office/word/2010/wordprocessingShape" mc:Ignorable="w14 w15 w16se w16cid w16 w16cex w16sdtdh w16sdtfl w16du wp14">
   <w:p>
     <w:pPr>
       <w:pStyle w:val="En-tte"/>
@@ -5201,7 +5210,7 @@
 </file>
 
 <file path=word/numbering.xml><?xml version="1.0" encoding="utf-8"?>
-<w:numbering xmlns:wpc="http://schemas.microsoft.com/office/word/2010/wordprocessingCanvas" xmlns:cx="http://schemas.microsoft.com/office/drawing/2014/chartex" xmlns:cx1="http://schemas.microsoft.com/office/drawing/2015/9/8/chartex" xmlns:cx2="http://schemas.microsoft.com/office/drawing/2015/10/21/chartex" xmlns:cx3="http://schemas.microsoft.com/office/drawing/2016/5/9/chartex" xmlns:cx4="http://schemas.microsoft.com/office/drawing/2016/5/10/chartex" xmlns:cx5="http://schemas.microsoft.com/office/drawing/2016/5/11/chartex" xmlns:cx6="http://schemas.microsoft.com/office/drawing/2016/5/12/chartex" xmlns:cx7="http://schemas.microsoft.com/office/drawing/2016/5/13/chartex" xmlns:cx8="http://schemas.microsoft.com/office/drawing/2016/5/14/chartex" xmlns:mc="http://schemas.openxmlformats.org/markup-compatibility/2006" xmlns:aink="http://schemas.microsoft.com/office/drawing/2016/ink" xmlns:am3d="http://schemas.microsoft.com/office/drawing/2017/model3d" xmlns:o="urn:schemas-microsoft-com:office:office" xmlns:oel="http://schemas.microsoft.com/office/2019/extlst" xmlns:r="http://schemas.openxmlformats.org/officeDocument/2006/relationships" xmlns:m="http://schemas.openxmlformats.org/officeDocument/2006/math" xmlns:v="urn:schemas-microsoft-com:vml" xmlns:wp14="http://schemas.microsoft.com/office/word/2010/wordprocessingDrawing" xmlns:wp="http://schemas.openxmlformats.org/drawingml/2006/wordprocessingDrawing" xmlns:w10="urn:schemas-microsoft-com:office:word" xmlns:w="http://schemas.openxmlformats.org/wordprocessingml/2006/main" xmlns:w14="http://schemas.microsoft.com/office/word/2010/wordml" xmlns:w15="http://schemas.microsoft.com/office/word/2012/wordml" xmlns:w16cei="http://schemas.microsoft.com/office/word/2026/wordml/cei" xmlns:w16cex="http://schemas.microsoft.com/office/word/2018/wordml/cex" xmlns:w16cid="http://schemas.microsoft.com/office/word/2016/wordml/cid" xmlns:w16="http://schemas.microsoft.com/office/word/2018/wordml" xmlns:w16du="http://schemas.microsoft.com/office/word/2023/wordml/word16du" xmlns:w16sdtdh="http://schemas.microsoft.com/office/word/2020/wordml/sdtdatahash" xmlns:w16sdtfl="http://schemas.microsoft.com/office/word/2024/wordml/sdtformatlock" xmlns:w16se="http://schemas.microsoft.com/office/word/2015/wordml/symex" xmlns:wpg="http://schemas.microsoft.com/office/word/2010/wordprocessingGroup" xmlns:wpi="http://schemas.microsoft.com/office/word/2010/wordprocessingInk" xmlns:wne="http://schemas.microsoft.com/office/word/2006/wordml" xmlns:wps="http://schemas.microsoft.com/office/word/2010/wordprocessingShape" mc:Ignorable="w14 w15 w16se w16cid w16 w16cex w16sdtdh w16sdtfl w16du wp14">
+<w:numbering xmlns:wpc="http://schemas.microsoft.com/office/word/2010/wordprocessingCanvas" xmlns:cx="http://schemas.microsoft.com/office/drawing/2014/chartex" xmlns:cx1="http://schemas.microsoft.com/office/drawing/2015/9/8/chartex" xmlns:cx2="http://schemas.microsoft.com/office/drawing/2015/10/21/chartex" xmlns:cx3="http://schemas.microsoft.com/office/drawing/2016/5/9/chartex" xmlns:cx4="http://schemas.microsoft.com/office/drawing/2016/5/10/chartex" xmlns:cx5="http://schemas.microsoft.com/office/drawing/2016/5/11/chartex" xmlns:cx6="http://schemas.microsoft.com/office/drawing/2016/5/12/chartex" xmlns:cx7="http://schemas.microsoft.com/office/drawing/2016/5/13/chartex" xmlns:cx8="http://schemas.microsoft.com/office/drawing/2016/5/14/chartex" xmlns:mc="http://schemas.openxmlformats.org/markup-compatibility/2006" xmlns:aink="http://schemas.microsoft.com/office/drawing/2016/ink" xmlns:am3d="http://schemas.microsoft.com/office/drawing/2017/model3d" xmlns:o="urn:schemas-microsoft-com:office:office" xmlns:oel="http://schemas.microsoft.com/office/2019/extlst" xmlns:r="http://schemas.openxmlformats.org/officeDocument/2006/relationships" xmlns:m="http://schemas.openxmlformats.org/officeDocument/2006/math" xmlns:v="urn:schemas-microsoft-com:vml" xmlns:wp14="http://schemas.microsoft.com/office/word/2010/wordprocessingDrawing" xmlns:wp="http://schemas.openxmlformats.org/drawingml/2006/wordprocessingDrawing" xmlns:w10="urn:schemas-microsoft-com:office:word" xmlns:w="http://schemas.openxmlformats.org/wordprocessingml/2006/main" xmlns:w14="http://schemas.microsoft.com/office/word/2010/wordml" xmlns:w15="http://schemas.microsoft.com/office/word/2012/wordml" xmlns:w16cex="http://schemas.microsoft.com/office/word/2018/wordml/cex" xmlns:w16cid="http://schemas.microsoft.com/office/word/2016/wordml/cid" xmlns:w16="http://schemas.microsoft.com/office/word/2018/wordml" xmlns:w16du="http://schemas.microsoft.com/office/word/2023/wordml/word16du" xmlns:w16sdtdh="http://schemas.microsoft.com/office/word/2020/wordml/sdtdatahash" xmlns:w16sdtfl="http://schemas.microsoft.com/office/word/2024/wordml/sdtformatlock" xmlns:w16se="http://schemas.microsoft.com/office/word/2015/wordml/symex" xmlns:wpg="http://schemas.microsoft.com/office/word/2010/wordprocessingGroup" xmlns:wpi="http://schemas.microsoft.com/office/word/2010/wordprocessingInk" xmlns:wne="http://schemas.microsoft.com/office/word/2006/wordml" xmlns:wps="http://schemas.microsoft.com/office/word/2010/wordprocessingShape" mc:Ignorable="w14 w15 w16se w16cid w16 w16cex w16sdtdh w16sdtfl w16du wp14">
   <w:numPicBullet w:numPicBulletId="0">
     <w:pict>
       <v:shapetype id="_x0000_t75" coordsize="21600,21600" o:spt="75" o:preferrelative="t" path="m@4@5l@4@11@9@11@9@5xe" filled="f" stroked="f">
@@ -5223,7 +5232,7 @@
         <v:path o:extrusionok="f" gradientshapeok="t" o:connecttype="rect"/>
         <o:lock v:ext="edit" aspectratio="t"/>
       </v:shapetype>
-      <v:shape id="_x0000_i1025" type="#_x0000_t75" alt="Mégaphone1 avec un remplissage uni" style="width:12.75pt;height:10.5pt;visibility:visible" o:gfxdata="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" o:bullet="t">
+      <v:shape id="_x0000_i1025" type="#_x0000_t75" alt="Mégaphone1 avec un remplissage uni" style="width:12.9pt;height:10.75pt;visibility:visible" o:gfxdata="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" o:bullet="t">
         <v:imagedata r:id="rId1" o:title="" croptop="-9007f" cropbottom="-12734f" cropleft="-2530f" cropright="-3036f"/>
       </v:shape>
     </w:pict>

</xml_diff>